<commit_message>
data: add FGR-HO0102, FGR-RS0101 to feature_desc_sample.docx (5 features total)
Co-Authored-By: Claude Sonnet 4.6 <noreply@anthropic.com>
</commit_message>
<xml_diff>
--- a/spar/data/samples/feature_desc_sample.docx
+++ b/spar/data/samples/feature_desc_sample.docx
@@ -461,6 +461,246 @@
       </w:tr>
     </w:tbl>
     <w:p/>
+    <w:p>
+      <w:pPr>
+        <w:pStyle w:val="Heading1"/>
+      </w:pPr>
+      <w:r>
+        <w:t>Event-Triggered Measurement</w:t>
+      </w:r>
+    </w:p>
+    <w:p>
+      <w:r>
+        <w:rPr>
+          <w:b/>
+        </w:rPr>
+        <w:t xml:space="preserve">Feature ID: </w:t>
+      </w:r>
+      <w:r>
+        <w:t>FGR-HO0102</w:t>
+      </w:r>
+    </w:p>
+    <w:p>
+      <w:pPr>
+        <w:pStyle w:val="Heading2"/>
+      </w:pPr>
+      <w:r>
+        <w:t>1. Introduction</w:t>
+      </w:r>
+    </w:p>
+    <w:p>
+      <w:r>
+        <w:t>Event-Triggered Measurement controls the UE measurement reporting behavior for handover decisions. It defines the time-to-trigger (TTT) duration that the A3 condition must be met before a measurement report is generated.</w:t>
+      </w:r>
+    </w:p>
+    <w:p>
+      <w:pPr>
+        <w:pStyle w:val="Heading2"/>
+      </w:pPr>
+      <w:r>
+        <w:t>2. Configuration</w:t>
+      </w:r>
+    </w:p>
+    <w:p>
+      <w:r>
+        <w:t>Measurement is configured under NRCellCU via the MeasConfig MO. The time-to-trigger parameter determines how long the A3 event condition must persist before triggering a report, reducing handover ping-pong effects.</w:t>
+      </w:r>
+    </w:p>
+    <w:p>
+      <w:pPr>
+        <w:pStyle w:val="Heading2"/>
+      </w:pPr>
+      <w:r>
+        <w:t>3. Key Parameters</w:t>
+      </w:r>
+    </w:p>
+    <w:tbl>
+      <w:tblPr>
+        <w:tblStyle w:val="TableGrid"/>
+        <w:tblW w:type="auto" w:w="0"/>
+        <w:tblLook w:firstColumn="1" w:firstRow="1" w:lastColumn="0" w:lastRow="0" w:noHBand="0" w:noVBand="1" w:val="04A0"/>
+      </w:tblPr>
+      <w:tblGrid>
+        <w:gridCol w:w="4320"/>
+        <w:gridCol w:w="4320"/>
+      </w:tblGrid>
+      <w:tr>
+        <w:tc>
+          <w:tcPr>
+            <w:tcW w:type="dxa" w:w="4320"/>
+          </w:tcPr>
+          <w:p>
+            <w:r>
+              <w:t>Parameter Name</w:t>
+            </w:r>
+          </w:p>
+        </w:tc>
+        <w:tc>
+          <w:tcPr>
+            <w:tcW w:type="dxa" w:w="4320"/>
+          </w:tcPr>
+          <w:p>
+            <w:r>
+              <w:t>Description</w:t>
+            </w:r>
+          </w:p>
+        </w:tc>
+      </w:tr>
+      <w:tr>
+        <w:tc>
+          <w:tcPr>
+            <w:tcW w:type="dxa" w:w="4320"/>
+          </w:tcPr>
+          <w:p>
+            <w:r>
+              <w:t>meas-time-to-trigger</w:t>
+            </w:r>
+          </w:p>
+        </w:tc>
+        <w:tc>
+          <w:tcPr>
+            <w:tcW w:type="dxa" w:w="4320"/>
+          </w:tcPr>
+          <w:p>
+            <w:r>
+              <w:t>Time-to-trigger for event evaluation. Values: 0ms to 640ms.</w:t>
+            </w:r>
+          </w:p>
+        </w:tc>
+      </w:tr>
+    </w:tbl>
+    <w:p/>
+    <w:p>
+      <w:pPr>
+        <w:pStyle w:val="Heading1"/>
+      </w:pPr>
+      <w:r>
+        <w:t>Random Access Channel Configuration</w:t>
+      </w:r>
+    </w:p>
+    <w:p>
+      <w:r>
+        <w:rPr>
+          <w:b/>
+        </w:rPr>
+        <w:t xml:space="preserve">Feature ID: </w:t>
+      </w:r>
+      <w:r>
+        <w:t>FGR-RS0101</w:t>
+      </w:r>
+    </w:p>
+    <w:p>
+      <w:pPr>
+        <w:pStyle w:val="Heading2"/>
+      </w:pPr>
+      <w:r>
+        <w:t>1. Introduction</w:t>
+      </w:r>
+    </w:p>
+    <w:p>
+      <w:r>
+        <w:t>Random Access Channel (RACH) Configuration controls the initial access procedure for UEs entering connected mode. It defines the target preamble power and the power ramping step used during preamble retransmissions.</w:t>
+      </w:r>
+    </w:p>
+    <w:p>
+      <w:pPr>
+        <w:pStyle w:val="Heading2"/>
+      </w:pPr>
+      <w:r>
+        <w:t>2. Configuration</w:t>
+      </w:r>
+    </w:p>
+    <w:p>
+      <w:r>
+        <w:t>RACH is configured under NRCellDU via the RachConfig MO. The target received power sets the initial preamble power level. The power ramping step controls how aggressively power is increased on retransmission.</w:t>
+      </w:r>
+    </w:p>
+    <w:p>
+      <w:pPr>
+        <w:pStyle w:val="Heading2"/>
+      </w:pPr>
+      <w:r>
+        <w:t>3. Key Parameters</w:t>
+      </w:r>
+    </w:p>
+    <w:tbl>
+      <w:tblPr>
+        <w:tblStyle w:val="TableGrid"/>
+        <w:tblW w:type="auto" w:w="0"/>
+        <w:tblLook w:firstColumn="1" w:firstRow="1" w:lastColumn="0" w:lastRow="0" w:noHBand="0" w:noVBand="1" w:val="04A0"/>
+      </w:tblPr>
+      <w:tblGrid>
+        <w:gridCol w:w="4320"/>
+        <w:gridCol w:w="4320"/>
+      </w:tblGrid>
+      <w:tr>
+        <w:tc>
+          <w:tcPr>
+            <w:tcW w:type="dxa" w:w="4320"/>
+          </w:tcPr>
+          <w:p>
+            <w:r>
+              <w:t>Parameter Name</w:t>
+            </w:r>
+          </w:p>
+        </w:tc>
+        <w:tc>
+          <w:tcPr>
+            <w:tcW w:type="dxa" w:w="4320"/>
+          </w:tcPr>
+          <w:p>
+            <w:r>
+              <w:t>Description</w:t>
+            </w:r>
+          </w:p>
+        </w:tc>
+      </w:tr>
+      <w:tr>
+        <w:tc>
+          <w:tcPr>
+            <w:tcW w:type="dxa" w:w="4320"/>
+          </w:tcPr>
+          <w:p>
+            <w:r>
+              <w:t>rach-preamble-target-power</w:t>
+            </w:r>
+          </w:p>
+        </w:tc>
+        <w:tc>
+          <w:tcPr>
+            <w:tcW w:type="dxa" w:w="4320"/>
+          </w:tcPr>
+          <w:p>
+            <w:r>
+              <w:t>Initial target received power for preamble in dBm.</w:t>
+            </w:r>
+          </w:p>
+        </w:tc>
+      </w:tr>
+      <w:tr>
+        <w:tc>
+          <w:tcPr>
+            <w:tcW w:type="dxa" w:w="4320"/>
+          </w:tcPr>
+          <w:p>
+            <w:r>
+              <w:t>rach-power-ramping-step</w:t>
+            </w:r>
+          </w:p>
+        </w:tc>
+        <w:tc>
+          <w:tcPr>
+            <w:tcW w:type="dxa" w:w="4320"/>
+          </w:tcPr>
+          <w:p>
+            <w:r>
+              <w:t>Power ramping step for preamble retransmission. Values: 0dB, 2dB, 4dB, 6dB.</w:t>
+            </w:r>
+          </w:p>
+        </w:tc>
+      </w:tr>
+    </w:tbl>
+    <w:p/>
     <w:sectPr>
       <w:pgSz w:w="12240" w:h="15840"/>
       <w:pgMar w:top="1440" w:right="1800" w:bottom="1440" w:left="1800" w:header="720" w:footer="720" w:gutter="0"/>

</xml_diff>